<commit_message>
Update the Word resume to the latest version
The PDF and DOCX had drifted apart: the DOCX on the site was still the
older export, so the Word download served stale content.

Co-Authored-By: Claude Opus 5 (1M context) <noreply@anthropic.com>
</commit_message>
<xml_diff>
--- a/Ariel_Menda_Resume.docx
+++ b/Ariel_Menda_Resume.docx
@@ -1,6 +1,6 @@
 
 <file path=word/document.xml><?xml version="1.0" encoding="utf-8"?>
-<w:document xmlns:wpc="http://schemas.microsoft.com/office/word/2010/wordprocessingCanvas" xmlns:cx="http://schemas.microsoft.com/office/drawing/2014/chartex" xmlns:cx1="http://schemas.microsoft.com/office/drawing/2015/9/8/chartex" xmlns:cx2="http://schemas.microsoft.com/office/drawing/2015/10/21/chartex" xmlns:cx3="http://schemas.microsoft.com/office/drawing/2016/5/9/chartex" xmlns:cx4="http://schemas.microsoft.com/office/drawing/2016/5/10/chartex" xmlns:cx5="http://schemas.microsoft.com/office/drawing/2016/5/11/chartex" xmlns:cx6="http://schemas.microsoft.com/office/drawing/2016/5/12/chartex" xmlns:cx7="http://schemas.microsoft.com/office/drawing/2016/5/13/chartex" xmlns:cx8="http://schemas.microsoft.com/office/drawing/2016/5/14/chartex" xmlns:mc="http://schemas.openxmlformats.org/markup-compatibility/2006" xmlns:aink="http://schemas.microsoft.com/office/drawing/2016/ink" xmlns:am3d="http://schemas.microsoft.com/office/drawing/2017/model3d" xmlns:o="urn:schemas-microsoft-com:office:office" xmlns:oel="http://schemas.microsoft.com/office/2019/extlst" xmlns:r="http://schemas.openxmlformats.org/officeDocument/2006/relationships" xmlns:m="http://schemas.openxmlformats.org/officeDocument/2006/math" xmlns:v="urn:schemas-microsoft-com:vml" xmlns:wp14="http://schemas.microsoft.com/office/word/2010/wordprocessingDrawing" xmlns:wp="http://schemas.openxmlformats.org/drawingml/2006/wordprocessingDrawing" xmlns:w10="urn:schemas-microsoft-com:office:word" xmlns:w="http://schemas.openxmlformats.org/wordprocessingml/2006/main" xmlns:w14="http://schemas.microsoft.com/office/word/2010/wordml" xmlns:w15="http://schemas.microsoft.com/office/word/2012/wordml" xmlns:w16cex="http://schemas.microsoft.com/office/word/2018/wordml/cex" xmlns:w16cid="http://schemas.microsoft.com/office/word/2016/wordml/cid" xmlns:w16="http://schemas.microsoft.com/office/word/2018/wordml" xmlns:w16du="http://schemas.microsoft.com/office/word/2023/wordml/word16du" xmlns:w16sdtdh="http://schemas.microsoft.com/office/word/2020/wordml/sdtdatahash" xmlns:w16sdtfl="http://schemas.microsoft.com/office/word/2024/wordml/sdtformatlock" xmlns:w16se="http://schemas.microsoft.com/office/word/2015/wordml/symex" xmlns:wpg="http://schemas.microsoft.com/office/word/2010/wordprocessingGroup" xmlns:wpi="http://schemas.microsoft.com/office/word/2010/wordprocessingInk" xmlns:wne="http://schemas.microsoft.com/office/word/2006/wordml" xmlns:wps="http://schemas.microsoft.com/office/word/2010/wordprocessingShape" mc:Ignorable="w14 w15 w16se w16cid w16 w16cex w16sdtdh w16sdtfl w16du wp14">
+<w:document xmlns:wpc="http://schemas.microsoft.com/office/word/2010/wordprocessingCanvas" xmlns:cx="http://schemas.microsoft.com/office/drawing/2014/chartex" xmlns:cx1="http://schemas.microsoft.com/office/drawing/2015/9/8/chartex" xmlns:cx2="http://schemas.microsoft.com/office/drawing/2015/10/21/chartex" xmlns:cx3="http://schemas.microsoft.com/office/drawing/2016/5/9/chartex" xmlns:cx4="http://schemas.microsoft.com/office/drawing/2016/5/10/chartex" xmlns:cx5="http://schemas.microsoft.com/office/drawing/2016/5/11/chartex" xmlns:cx6="http://schemas.microsoft.com/office/drawing/2016/5/12/chartex" xmlns:cx7="http://schemas.microsoft.com/office/drawing/2016/5/13/chartex" xmlns:cx8="http://schemas.microsoft.com/office/drawing/2016/5/14/chartex" xmlns:mc="http://schemas.openxmlformats.org/markup-compatibility/2006" xmlns:aink="http://schemas.microsoft.com/office/drawing/2016/ink" xmlns:am3d="http://schemas.microsoft.com/office/drawing/2017/model3d" xmlns:o="urn:schemas-microsoft-com:office:office" xmlns:oel="http://schemas.microsoft.com/office/2019/extlst" xmlns:r="http://schemas.openxmlformats.org/officeDocument/2006/relationships" xmlns:m="http://schemas.openxmlformats.org/officeDocument/2006/math" xmlns:v="urn:schemas-microsoft-com:vml" xmlns:wp14="http://schemas.microsoft.com/office/word/2010/wordprocessingDrawing" xmlns:wp="http://schemas.openxmlformats.org/drawingml/2006/wordprocessingDrawing" xmlns:w10="urn:schemas-microsoft-com:office:word" xmlns:w="http://schemas.openxmlformats.org/wordprocessingml/2006/main" xmlns:w14="http://schemas.microsoft.com/office/word/2010/wordml" xmlns:w15="http://schemas.microsoft.com/office/word/2012/wordml" xmlns:w16cei="http://schemas.microsoft.com/office/word/2026/wordml/cei" xmlns:w16cex="http://schemas.microsoft.com/office/word/2018/wordml/cex" xmlns:w16cid="http://schemas.microsoft.com/office/word/2016/wordml/cid" xmlns:w16="http://schemas.microsoft.com/office/word/2018/wordml" xmlns:w16du="http://schemas.microsoft.com/office/word/2023/wordml/word16du" xmlns:w16sdtdh="http://schemas.microsoft.com/office/word/2020/wordml/sdtdatahash" xmlns:w16sdtfl="http://schemas.microsoft.com/office/word/2024/wordml/sdtformatlock" xmlns:w16se="http://schemas.microsoft.com/office/word/2015/wordml/symex" xmlns:wpg="http://schemas.microsoft.com/office/word/2010/wordprocessingGroup" xmlns:wpi="http://schemas.microsoft.com/office/word/2010/wordprocessingInk" xmlns:wne="http://schemas.microsoft.com/office/word/2006/wordml" xmlns:wps="http://schemas.microsoft.com/office/word/2010/wordprocessingShape" mc:Ignorable="w14 w15 w16se w16cid w16 w16cex w16sdtdh w16sdtfl w16du wp14">
   <w:body>
     <w:p>
       <w:pPr>
@@ -397,25 +397,7 @@
           <w:color w:val="2D3748"/>
           <w:sz w:val="20"/>
         </w:rPr>
-        <w:t xml:space="preserve">Collaborate closely with R&amp;D, product management, Other QA and security researchers to identify system bottlenecks and ensure </w:t>
-      </w:r>
-      <w:proofErr w:type="gramStart"/>
-      <w:r>
-        <w:rPr>
-          <w:rFonts w:ascii="Calibri" w:hAnsi="Calibri"/>
-          <w:color w:val="2D3748"/>
-          <w:sz w:val="20"/>
-        </w:rPr>
-        <w:t>feature quality</w:t>
-      </w:r>
-      <w:proofErr w:type="gramEnd"/>
-      <w:r>
-        <w:rPr>
-          <w:rFonts w:ascii="Calibri" w:hAnsi="Calibri"/>
-          <w:color w:val="2D3748"/>
-          <w:sz w:val="20"/>
-        </w:rPr>
-        <w:t>.</w:t>
+        <w:t>Collaborate closely with R&amp;D, product management, Other QA and security researchers to identify system bottlenecks and ensure feature quality.</w:t>
       </w:r>
     </w:p>
     <w:p>
@@ -463,27 +445,7 @@
                 <w:color w:val="1A365D"/>
                 <w:sz w:val="21"/>
               </w:rPr>
-              <w:t>Partner Communications Company (</w:t>
-            </w:r>
-            <w:proofErr w:type="gramStart"/>
-            <w:r>
-              <w:rPr>
-                <w:rFonts w:ascii="Calibri" w:hAnsi="Calibri"/>
-                <w:b/>
-                <w:color w:val="1A365D"/>
-                <w:sz w:val="21"/>
-              </w:rPr>
-              <w:t>Orange)  |</w:t>
-            </w:r>
-            <w:proofErr w:type="gramEnd"/>
-            <w:r>
-              <w:rPr>
-                <w:rFonts w:ascii="Calibri" w:hAnsi="Calibri"/>
-                <w:b/>
-                <w:color w:val="1A365D"/>
-                <w:sz w:val="21"/>
-              </w:rPr>
-              <w:t xml:space="preserve">  Israel</w:t>
+              <w:t>Partner Communications Company (Orange)  |  Israel</w:t>
             </w:r>
           </w:p>
         </w:tc>
@@ -781,6 +743,10 @@
       <w:pPr>
         <w:pStyle w:val="ListBullet"/>
         <w:spacing w:before="20" w:after="60"/>
+        <w:rPr>
+          <w:rFonts w:ascii="Calibri" w:hAnsi="Calibri"/>
+          <w:color w:val="2D3748"/>
+        </w:rPr>
       </w:pPr>
       <w:r>
         <w:rPr>
@@ -797,7 +763,67 @@
           <w:color w:val="2D3748"/>
           <w:sz w:val="20"/>
         </w:rPr>
-        <w:t xml:space="preserve"> Practical Engineer in Mechatronics — ORT Hermelin Netanya &amp; ORT Herzliya</w:t>
+        <w:t xml:space="preserve"> Practical Engineer in Mechatronics — ORT Hermelin Netanya </w:t>
+      </w:r>
+    </w:p>
+    <w:p>
+      <w:pPr>
+        <w:pStyle w:val="ListBullet"/>
+        <w:spacing w:before="20" w:after="60"/>
+        <w:rPr>
+          <w:rFonts w:ascii="Calibri" w:hAnsi="Calibri"/>
+          <w:color w:val="2D3748"/>
+        </w:rPr>
+      </w:pPr>
+      <w:r>
+        <w:rPr>
+          <w:rFonts w:ascii="Calibri" w:hAnsi="Calibri"/>
+          <w:color w:val="2D3748"/>
+          <w:sz w:val="20"/>
+        </w:rPr>
+        <w:t xml:space="preserve"> </w:t>
+      </w:r>
+      <w:r>
+        <w:rPr>
+          <w:rFonts w:ascii="Calibri" w:hAnsi="Calibri"/>
+          <w:b/>
+          <w:color w:val="2D3748"/>
+          <w:sz w:val="20"/>
+        </w:rPr>
+        <w:t>Education</w:t>
+      </w:r>
+      <w:r>
+        <w:rPr>
+          <w:rFonts w:ascii="Calibri" w:hAnsi="Calibri"/>
+          <w:color w:val="2D3748"/>
+          <w:sz w:val="20"/>
+        </w:rPr>
+        <w:t xml:space="preserve">: </w:t>
+      </w:r>
+      <w:r>
+        <w:rPr>
+          <w:rFonts w:ascii="Calibri" w:hAnsi="Calibri"/>
+          <w:color w:val="2D3748"/>
+          <w:lang w:val="en"/>
+        </w:rPr>
+        <w:t>Mechanical technician</w:t>
+      </w:r>
+      <w:r>
+        <w:rPr>
+          <w:rFonts w:ascii="Calibri" w:hAnsi="Calibri" w:hint="cs"/>
+          <w:color w:val="2D3748"/>
+          <w:rtl/>
+          <w:lang w:bidi="he-IL"/>
+        </w:rPr>
+        <w:t xml:space="preserve"> </w:t>
+      </w:r>
+      <w:r>
+        <w:rPr>
+          <w:rFonts w:ascii="Calibri" w:hAnsi="Calibri"/>
+          <w:color w:val="2D3748"/>
+          <w:sz w:val="20"/>
+        </w:rPr>
+        <w:t>ORT Herzliya</w:t>
       </w:r>
     </w:p>
     <w:p>
@@ -975,7 +1001,7 @@
 </file>
 
 <file path=word/numbering.xml><?xml version="1.0" encoding="utf-8"?>
-<w:numbering xmlns:wpc="http://schemas.microsoft.com/office/word/2010/wordprocessingCanvas" xmlns:cx="http://schemas.microsoft.com/office/drawing/2014/chartex" xmlns:cx1="http://schemas.microsoft.com/office/drawing/2015/9/8/chartex" xmlns:cx2="http://schemas.microsoft.com/office/drawing/2015/10/21/chartex" xmlns:cx3="http://schemas.microsoft.com/office/drawing/2016/5/9/chartex" xmlns:cx4="http://schemas.microsoft.com/office/drawing/2016/5/10/chartex" xmlns:cx5="http://schemas.microsoft.com/office/drawing/2016/5/11/chartex" xmlns:cx6="http://schemas.microsoft.com/office/drawing/2016/5/12/chartex" xmlns:cx7="http://schemas.microsoft.com/office/drawing/2016/5/13/chartex" xmlns:cx8="http://schemas.microsoft.com/office/drawing/2016/5/14/chartex" xmlns:mc="http://schemas.openxmlformats.org/markup-compatibility/2006" xmlns:aink="http://schemas.microsoft.com/office/drawing/2016/ink" xmlns:am3d="http://schemas.microsoft.com/office/drawing/2017/model3d" xmlns:o="urn:schemas-microsoft-com:office:office" xmlns:oel="http://schemas.microsoft.com/office/2019/extlst" xmlns:r="http://schemas.openxmlformats.org/officeDocument/2006/relationships" xmlns:m="http://schemas.openxmlformats.org/officeDocument/2006/math" xmlns:v="urn:schemas-microsoft-com:vml" xmlns:wp14="http://schemas.microsoft.com/office/word/2010/wordprocessingDrawing" xmlns:wp="http://schemas.openxmlformats.org/drawingml/2006/wordprocessingDrawing" xmlns:w10="urn:schemas-microsoft-com:office:word" xmlns:w="http://schemas.openxmlformats.org/wordprocessingml/2006/main" xmlns:w14="http://schemas.microsoft.com/office/word/2010/wordml" xmlns:w15="http://schemas.microsoft.com/office/word/2012/wordml" xmlns:w16cex="http://schemas.microsoft.com/office/word/2018/wordml/cex" xmlns:w16cid="http://schemas.microsoft.com/office/word/2016/wordml/cid" xmlns:w16="http://schemas.microsoft.com/office/word/2018/wordml" xmlns:w16du="http://schemas.microsoft.com/office/word/2023/wordml/word16du" xmlns:w16sdtdh="http://schemas.microsoft.com/office/word/2020/wordml/sdtdatahash" xmlns:w16sdtfl="http://schemas.microsoft.com/office/word/2024/wordml/sdtformatlock" xmlns:w16se="http://schemas.microsoft.com/office/word/2015/wordml/symex" xmlns:wpg="http://schemas.microsoft.com/office/word/2010/wordprocessingGroup" xmlns:wpi="http://schemas.microsoft.com/office/word/2010/wordprocessingInk" xmlns:wne="http://schemas.microsoft.com/office/word/2006/wordml" xmlns:wps="http://schemas.microsoft.com/office/word/2010/wordprocessingShape" mc:Ignorable="w14 w15 w16se w16cid w16 w16cex w16sdtdh w16sdtfl w16du wp14">
+<w:numbering xmlns:wpc="http://schemas.microsoft.com/office/word/2010/wordprocessingCanvas" xmlns:cx="http://schemas.microsoft.com/office/drawing/2014/chartex" xmlns:cx1="http://schemas.microsoft.com/office/drawing/2015/9/8/chartex" xmlns:cx2="http://schemas.microsoft.com/office/drawing/2015/10/21/chartex" xmlns:cx3="http://schemas.microsoft.com/office/drawing/2016/5/9/chartex" xmlns:cx4="http://schemas.microsoft.com/office/drawing/2016/5/10/chartex" xmlns:cx5="http://schemas.microsoft.com/office/drawing/2016/5/11/chartex" xmlns:cx6="http://schemas.microsoft.com/office/drawing/2016/5/12/chartex" xmlns:cx7="http://schemas.microsoft.com/office/drawing/2016/5/13/chartex" xmlns:cx8="http://schemas.microsoft.com/office/drawing/2016/5/14/chartex" xmlns:mc="http://schemas.openxmlformats.org/markup-compatibility/2006" xmlns:aink="http://schemas.microsoft.com/office/drawing/2016/ink" xmlns:am3d="http://schemas.microsoft.com/office/drawing/2017/model3d" xmlns:o="urn:schemas-microsoft-com:office:office" xmlns:oel="http://schemas.microsoft.com/office/2019/extlst" xmlns:r="http://schemas.openxmlformats.org/officeDocument/2006/relationships" xmlns:m="http://schemas.openxmlformats.org/officeDocument/2006/math" xmlns:v="urn:schemas-microsoft-com:vml" xmlns:wp14="http://schemas.microsoft.com/office/word/2010/wordprocessingDrawing" xmlns:wp="http://schemas.openxmlformats.org/drawingml/2006/wordprocessingDrawing" xmlns:w10="urn:schemas-microsoft-com:office:word" xmlns:w="http://schemas.openxmlformats.org/wordprocessingml/2006/main" xmlns:w14="http://schemas.microsoft.com/office/word/2010/wordml" xmlns:w15="http://schemas.microsoft.com/office/word/2012/wordml" xmlns:w16cei="http://schemas.microsoft.com/office/word/2026/wordml/cei" xmlns:w16cex="http://schemas.microsoft.com/office/word/2018/wordml/cex" xmlns:w16cid="http://schemas.microsoft.com/office/word/2016/wordml/cid" xmlns:w16="http://schemas.microsoft.com/office/word/2018/wordml" xmlns:w16du="http://schemas.microsoft.com/office/word/2023/wordml/word16du" xmlns:w16sdtdh="http://schemas.microsoft.com/office/word/2020/wordml/sdtdatahash" xmlns:w16sdtfl="http://schemas.microsoft.com/office/word/2024/wordml/sdtformatlock" xmlns:w16se="http://schemas.microsoft.com/office/word/2015/wordml/symex" xmlns:wpg="http://schemas.microsoft.com/office/word/2010/wordprocessingGroup" xmlns:wpi="http://schemas.microsoft.com/office/word/2010/wordprocessingInk" xmlns:wne="http://schemas.microsoft.com/office/word/2006/wordml" xmlns:wps="http://schemas.microsoft.com/office/word/2010/wordprocessingShape" mc:Ignorable="w14 w15 w16se w16cid w16 w16cex w16sdtdh w16sdtfl w16du wp14">
   <w:abstractNum w:abstractNumId="0" w15:restartNumberingAfterBreak="0">
     <w:nsid w:val="FFFFFF7C"/>
     <w:multiLevelType w:val="singleLevel"/>
@@ -12556,6 +12582,36 @@
       </w:tcPr>
     </w:tblStylePr>
   </w:style>
+  <w:style w:type="paragraph" w:styleId="HTMLPreformatted">
+    <w:name w:val="HTML Preformatted"/>
+    <w:basedOn w:val="Normal"/>
+    <w:link w:val="HTMLPreformattedChar"/>
+    <w:uiPriority w:val="99"/>
+    <w:semiHidden/>
+    <w:unhideWhenUsed/>
+    <w:rsid w:val="00ED1288"/>
+    <w:pPr>
+      <w:spacing w:after="0" w:line="240" w:lineRule="auto"/>
+    </w:pPr>
+    <w:rPr>
+      <w:rFonts w:ascii="Consolas" w:hAnsi="Consolas"/>
+      <w:sz w:val="20"/>
+      <w:szCs w:val="20"/>
+    </w:rPr>
+  </w:style>
+  <w:style w:type="character" w:customStyle="1" w:styleId="HTMLPreformattedChar">
+    <w:name w:val="HTML Preformatted Char"/>
+    <w:basedOn w:val="DefaultParagraphFont"/>
+    <w:link w:val="HTMLPreformatted"/>
+    <w:uiPriority w:val="99"/>
+    <w:semiHidden/>
+    <w:rsid w:val="00ED1288"/>
+    <w:rPr>
+      <w:rFonts w:ascii="Consolas" w:hAnsi="Consolas"/>
+      <w:sz w:val="20"/>
+      <w:szCs w:val="20"/>
+    </w:rPr>
+  </w:style>
 </w:styles>
 </file>
 

</xml_diff>